<commit_message>
Align chapter 5, slides and speech with four-step purchase path
Co-Authored-By: Claude Opus 5.5 <noreply@anthropic.com>
Claude-Session: https://claude.ai/code/session_01CU6W6huYbDSXyzWhJKPgvt
</commit_message>
<xml_diff>
--- a/ppt/v4/演讲稿_制作1负责页面.docx
+++ b/ppt/v4/演讲稿_制作1负责页面.docx
@@ -725,7 +725,7 @@
                 <w:sz w:val="21"/>
                 <w:szCs w:val="21"/>
               </w:rPr>
-              <w:t xml:space="preserve">P3 年轻人五步买零食，美枣王步步掉队</w:t>
+              <w:t xml:space="preserve">P3 年轻人四步买零食，美枣王步步掉队</w:t>
             </w:r>
           </w:p>
         </w:tc>
@@ -781,7 +781,7 @@
                 <w:sz w:val="21"/>
                 <w:szCs w:val="21"/>
               </w:rPr>
-              <w:t xml:space="preserve">29 秒</w:t>
+              <w:t xml:space="preserve">28 秒</w:t>
             </w:r>
           </w:p>
         </w:tc>
@@ -1605,7 +1605,7 @@
                 <w:sz w:val="21"/>
                 <w:szCs w:val="21"/>
               </w:rPr>
-              <w:t xml:space="preserve">2 分 2 秒</w:t>
+              <w:t xml:space="preserve">2 分 1 秒</w:t>
             </w:r>
           </w:p>
         </w:tc>
@@ -2154,7 +2154,7 @@
         <w:pStyle w:val="Heading2"/>
       </w:pPr>
       <w:r>
-        <w:t xml:space="preserve">P3 年轻人五步买零食，美枣王步步掉队</w:t>
+        <w:t xml:space="preserve">P3 年轻人四步买零食，美枣王步步掉队</w:t>
       </w:r>
     </w:p>
     <w:p>
@@ -2167,7 +2167,7 @@
           <w:sz w:val="20"/>
           <w:szCs w:val="20"/>
         </w:rPr>
-        <w:t xml:space="preserve">约 29 秒</w:t>
+        <w:t xml:space="preserve">约 28 秒</w:t>
       </w:r>
     </w:p>
     <w:p>
@@ -2190,7 +2190,7 @@
         <w:spacing w:after="160" w:line="400"/>
       </w:pPr>
       <w:r>
-        <w:t xml:space="preserve">这就是年轻人买零食的五步：</w:t>
+        <w:t xml:space="preserve">这就是年轻人买零食的四步：</w:t>
       </w:r>
       <w:r>
         <w:rPr>
@@ -2198,7 +2198,7 @@
           <w:bCs/>
           <w:color w:val="7A1426"/>
         </w:rPr>
-        <w:t xml:space="preserve">种草、尝鲜、第一口、验证、复购</w:t>
+        <w:t xml:space="preserve">种草、尝鲜、验证、复购</w:t>
       </w:r>
       <w:r>
         <w:t xml:space="preserve">。</w:t>
@@ -2245,7 +2245,7 @@
           <w:sz w:val="20"/>
           <w:szCs w:val="20"/>
         </w:rPr>
-        <w:t xml:space="preserve">第一句必须是演讲人自己真实发生过的事，老师很可能追问。讲五步时手从左往右指着路径图走。</w:t>
+        <w:t xml:space="preserve">第一句必须是演讲人自己真实发生过的事，老师很可能追问。讲四步时手从左往右指着路径图走。</w:t>
       </w:r>
     </w:p>
     <w:p>

</xml_diff>